<commit_message>
TESTS: Novos testes implementados, sao teste de logica e nao de infra
</commit_message>
<xml_diff>
--- a/backend/uploads/peticoes/T1/peticao_inicial_T1.docx
+++ b/backend/uploads/peticoes/T1/peticao_inicial_T1.docx
@@ -488,7 +488,31 @@
           <w:szCs w:val="24"/>
           <w:rtl w:val="0"/>
         </w:rPr>
-        <w:t xml:space="preserve">Texto IA (Setup Mock)</w:t>
+        <w:t xml:space="preserve">Relato do assistido: Relato de teste.</w:t>
+      </w:r>
+      <w:r>
+        <w:br/>
+      </w:r>
+      <w:r>
+        <w:rPr>
+          <w:rFonts w:ascii="Garamond" w:cs="Garamond" w:eastAsia="Garamond" w:hAnsi="Garamond"/>
+          <w:sz w:val="24"/>
+          <w:szCs w:val="24"/>
+          <w:rtl w:val="0"/>
+        </w:rPr>
+        <w:t/>
+      </w:r>
+      <w:r>
+        <w:br/>
+      </w:r>
+      <w:r>
+        <w:rPr>
+          <w:rFonts w:ascii="Garamond" w:cs="Garamond" w:eastAsia="Garamond" w:hAnsi="Garamond"/>
+          <w:sz w:val="24"/>
+          <w:szCs w:val="24"/>
+          <w:rtl w:val="0"/>
+        </w:rPr>
+        <w:t xml:space="preserve">Os fatos narrados encontram respaldo nos documentos informados no formulário, tais como RG; CPF.</w:t>
       </w:r>
     </w:p>
     <w:p>
@@ -1267,7 +1291,7 @@
           <w:szCs w:val="24"/>
           <w:rtl w:val="0"/>
         </w:rPr>
-        <w:t xml:space="preserve">, 24 de abril de 2026.</w:t>
+        <w:t xml:space="preserve">, 25 de abril de 2026.</w:t>
       </w:r>
     </w:p>
     <w:p>

</xml_diff>